<commit_message>
Groups are 3 or 4 teams, never 5
The rulebook allowed a group of 5 for odd team counts. It will not happen —
groups will be 3 or 4 — and leaving it in the rules meant publishing a size
nobody intends to run.

Also drops the claim that every group plays 6 matches, which was only ever
true of a group of 4. A group of 3 plays 3, and the rules now say so, because
a referee counting down a station's fixture list should not find two missing.

Changed in the rulebook and in the site copy together, and re-checked: all 29
rules still match the document word for word.

Co-Authored-By: Claude Opus 5 <noreply@anthropic.com>
</commit_message>
<xml_diff>
--- a/smash/PSD-Smash-Tournament-Rules.docx
+++ b/smash/PSD-Smash-Tournament-Rules.docx
@@ -1116,36 +1116,36 @@
           <w:szCs w:val="19"/>
           <w:rtl w:val="0"/>
         </w:rPr>
-        <w:t xml:space="preserve">Teams are drawn into groups (</w:t>
-      </w:r>
-      <w:r>
-        <w:rPr>
-          <w:rFonts w:ascii="Calibri" w:cs="Calibri" w:eastAsia="Calibri" w:hAnsi="Calibri"/>
-          <w:b w:val="1"/>
-          <w:bCs w:val="1"/>
-          <w:sz w:val="19"/>
-          <w:szCs w:val="19"/>
-          <w:rtl w:val="0"/>
-        </w:rPr>
-        <w:t xml:space="preserve">4 teams per group</w:t>
-      </w:r>
-      <w:r>
-        <w:rPr>
-          <w:rFonts w:ascii="Calibri" w:cs="Calibri" w:eastAsia="Calibri" w:hAnsi="Calibri"/>
-          <w:sz w:val="19"/>
-          <w:szCs w:val="19"/>
-          <w:rtl w:val="0"/>
-        </w:rPr>
-        <w:t xml:space="preserve"> (odd amounts of teams will result in groups of 3 or 5)</w:t>
-      </w:r>
-      <w:r>
-        <w:rPr>
-          <w:rFonts w:ascii="Calibri" w:cs="Calibri" w:eastAsia="Calibri" w:hAnsi="Calibri"/>
-          <w:sz w:val="19"/>
-          <w:szCs w:val="19"/>
-          <w:rtl w:val="0"/>
-        </w:rPr>
-        <w:t xml:space="preserve"> — round-robin, 6 matches per group).</w:t>
+        <w:t xml:space="preserve">Teams are drawn into groups of </w:t>
+      </w:r>
+      <w:r>
+        <w:rPr>
+          <w:rFonts w:ascii="Calibri" w:cs="Calibri" w:eastAsia="Calibri" w:hAnsi="Calibri"/>
+          <w:b w:val="1"/>
+          <w:bCs w:val="1"/>
+          <w:sz w:val="19"/>
+          <w:szCs w:val="19"/>
+          <w:rtl w:val="0"/>
+        </w:rPr>
+        <w:t xml:space="preserve">4 teams</w:t>
+      </w:r>
+      <w:r>
+        <w:rPr>
+          <w:rFonts w:ascii="Calibri" w:cs="Calibri" w:eastAsia="Calibri" w:hAnsi="Calibri"/>
+          <w:sz w:val="19"/>
+          <w:szCs w:val="19"/>
+          <w:rtl w:val="0"/>
+        </w:rPr>
+        <w:t xml:space="preserve"> (odd amounts of teams will result in groups of 3)</w:t>
+      </w:r>
+      <w:r>
+        <w:rPr>
+          <w:rFonts w:ascii="Calibri" w:cs="Calibri" w:eastAsia="Calibri" w:hAnsi="Calibri"/>
+          <w:sz w:val="19"/>
+          <w:szCs w:val="19"/>
+          <w:rtl w:val="0"/>
+        </w:rPr>
+        <w:t xml:space="preserve"> — round-robin: a group of 4 plays 6 matches, a group of 3 plays 3.</w:t>
       </w:r>
       <w:r>
         <w:rPr>

</xml_diff>